<commit_message>
subindo novos documentos e fluxograma
</commit_message>
<xml_diff>
--- a/Documentos/Outros/Guia_Conducao_Instrutores.docx
+++ b/Documentos/Outros/Guia_Conducao_Instrutores.docx
@@ -238,7 +238,7 @@
           <w:color w:val="050517"/>
           <w:sz w:val="23"/>
         </w:rPr>
-        <w:t>Lucas Araujo e [nome do parceiro]</w:t>
+        <w:t>Lucas Galindo e Lucas Araujo</w:t>
       </w:r>
     </w:p>
     <w:p>
@@ -1946,20 +1946,7 @@
         <w:pStyle w:val="Compact"/>
       </w:pPr>
       <w:r>
-        <w:t xml:space="preserve">Capa dos slides: troque o texto</w:t>
-      </w:r>
-      <w:r>
-        <w:t xml:space="preserve"> </w:t>
-      </w:r>
-      <w:r>
-        <w:rPr>
-          <w:bCs/>
-          <w:b/>
-        </w:rPr>
-        <w:t xml:space="preserve">[nome do parceiro]</w:t>
-      </w:r>
-      <w:r>
-        <w:t xml:space="preserve">.</w:t>
+        <w:t xml:space="preserve">Capa dos slides: confira os nomes dos dois instrutores (Lucas Galindo e Lucas Araujo).</w:t>
       </w:r>
     </w:p>
     <w:bookmarkEnd w:id="23"/>

</xml_diff>